<commit_message>
Actualización de la plantilla del sprint
</commit_message>
<xml_diff>
--- a/sprints/Plantilla Sprint  - LibrosXpress.docx
+++ b/sprints/Plantilla Sprint  - LibrosXpress.docx
@@ -1,6 +1,6 @@
 
 <file path=word/document.xml><?xml version="1.0" encoding="utf-8"?>
-<w:document xmlns:wpc="http://schemas.microsoft.com/office/word/2010/wordprocessingCanvas" xmlns:cx="http://schemas.microsoft.com/office/drawing/2014/chartex" xmlns:cx1="http://schemas.microsoft.com/office/drawing/2015/9/8/chartex" xmlns:cx2="http://schemas.microsoft.com/office/drawing/2015/10/21/chartex" xmlns:cx3="http://schemas.microsoft.com/office/drawing/2016/5/9/chartex" xmlns:cx4="http://schemas.microsoft.com/office/drawing/2016/5/10/chartex" xmlns:cx5="http://schemas.microsoft.com/office/drawing/2016/5/11/chartex" xmlns:cx6="http://schemas.microsoft.com/office/drawing/2016/5/12/chartex" xmlns:cx7="http://schemas.microsoft.com/office/drawing/2016/5/13/chartex" xmlns:cx8="http://schemas.microsoft.com/office/drawing/2016/5/14/chartex" xmlns:mc="http://schemas.openxmlformats.org/markup-compatibility/2006" xmlns:aink="http://schemas.microsoft.com/office/drawing/2016/ink" xmlns:am3d="http://schemas.microsoft.com/office/drawing/2017/model3d" xmlns:o="urn:schemas-microsoft-com:office:office" xmlns:r="http://schemas.openxmlformats.org/officeDocument/2006/relationships" xmlns:m="http://schemas.openxmlformats.org/officeDocument/2006/math" xmlns:v="urn:schemas-microsoft-com:vml" xmlns:wp14="http://schemas.microsoft.com/office/word/2010/wordprocessingDrawing" xmlns:wp="http://schemas.openxmlformats.org/drawingml/2006/wordprocessingDrawing" xmlns:w10="urn:schemas-microsoft-com:office:word" xmlns:w="http://schemas.openxmlformats.org/wordprocessingml/2006/main" xmlns:w14="http://schemas.microsoft.com/office/word/2010/wordml" xmlns:w15="http://schemas.microsoft.com/office/word/2012/wordml" xmlns:w16cex="http://schemas.microsoft.com/office/word/2018/wordml/cex" xmlns:w16cid="http://schemas.microsoft.com/office/word/2016/wordml/cid" xmlns:w16="http://schemas.microsoft.com/office/word/2018/wordml" xmlns:w16sdtdh="http://schemas.microsoft.com/office/word/2020/wordml/sdtdatahash" xmlns:w16se="http://schemas.microsoft.com/office/word/2015/wordml/symex" xmlns:wpg="http://schemas.microsoft.com/office/word/2010/wordprocessingGroup" xmlns:wpi="http://schemas.microsoft.com/office/word/2010/wordprocessingInk" xmlns:wne="http://schemas.microsoft.com/office/word/2006/wordml" xmlns:wps="http://schemas.microsoft.com/office/word/2010/wordprocessingShape" mc:Ignorable="w14 w15 w16se w16cid w16 w16cex w16sdtdh wp14">
+<w:document xmlns:wpc="http://schemas.microsoft.com/office/word/2010/wordprocessingCanvas" xmlns:cx="http://schemas.microsoft.com/office/drawing/2014/chartex" xmlns:cx1="http://schemas.microsoft.com/office/drawing/2015/9/8/chartex" xmlns:cx2="http://schemas.microsoft.com/office/drawing/2015/10/21/chartex" xmlns:cx3="http://schemas.microsoft.com/office/drawing/2016/5/9/chartex" xmlns:cx4="http://schemas.microsoft.com/office/drawing/2016/5/10/chartex" xmlns:cx5="http://schemas.microsoft.com/office/drawing/2016/5/11/chartex" xmlns:cx6="http://schemas.microsoft.com/office/drawing/2016/5/12/chartex" xmlns:cx7="http://schemas.microsoft.com/office/drawing/2016/5/13/chartex" xmlns:cx8="http://schemas.microsoft.com/office/drawing/2016/5/14/chartex" xmlns:mc="http://schemas.openxmlformats.org/markup-compatibility/2006" xmlns:aink="http://schemas.microsoft.com/office/drawing/2016/ink" xmlns:am3d="http://schemas.microsoft.com/office/drawing/2017/model3d" xmlns:o="urn:schemas-microsoft-com:office:office" xmlns:r="http://schemas.openxmlformats.org/officeDocument/2006/relationships" xmlns:m="http://schemas.openxmlformats.org/officeDocument/2006/math" xmlns:v="urn:schemas-microsoft-com:vml" xmlns:wp14="http://schemas.microsoft.com/office/word/2010/wordprocessingDrawing" xmlns:wp="http://schemas.openxmlformats.org/drawingml/2006/wordprocessingDrawing" xmlns:w10="urn:schemas-microsoft-com:office:word" xmlns:w="http://schemas.openxmlformats.org/wordprocessingml/2006/main" xmlns:w14="http://schemas.microsoft.com/office/word/2010/wordml" xmlns:w15="http://schemas.microsoft.com/office/word/2012/wordml" xmlns:w16cid="http://schemas.microsoft.com/office/word/2016/wordml/cid" xmlns:w16se="http://schemas.microsoft.com/office/word/2015/wordml/symex" xmlns:wpg="http://schemas.microsoft.com/office/word/2010/wordprocessingGroup" xmlns:wpi="http://schemas.microsoft.com/office/word/2010/wordprocessingInk" xmlns:wne="http://schemas.microsoft.com/office/word/2006/wordml" xmlns:wps="http://schemas.microsoft.com/office/word/2010/wordprocessingShape" mc:Ignorable="w14 w15 w16se w16cid wp14">
   <w:body>
     <w:p>
       <w:pPr>
@@ -82,7 +82,7 @@
               </wp:anchor>
             </w:drawing>
           </mc:Choice>
-          <mc:Fallback xmlns:oel="http://schemas.microsoft.com/office/2019/extlst">
+          <mc:Fallback xmlns:oel="http://schemas.microsoft.com/office/2019/extlst" xmlns:w16sdtdh="http://schemas.microsoft.com/office/word/2020/wordml/sdtdatahash" xmlns:w16="http://schemas.microsoft.com/office/word/2018/wordml" xmlns:w16cex="http://schemas.microsoft.com/office/word/2018/wordml/cex">
             <w:pict>
               <v:rect w14:anchorId="2D05ECE6" id="Rectángulo 3" o:spid="_x0000_s1026" alt="rectángulo blanco para texto en portada" style="position:absolute;margin-left:-15.95pt;margin-top:73.85pt;width:310.15pt;height:681.65pt;z-index:-251656192;visibility:visible;mso-wrap-style:square;mso-width-percent:0;mso-height-percent:0;mso-wrap-distance-left:9pt;mso-wrap-distance-top:0;mso-wrap-distance-right:9pt;mso-wrap-distance-bottom:0;mso-position-horizontal:absolute;mso-position-horizontal-relative:text;mso-position-vertical:absolute;mso-position-vertical-relative:page;mso-width-percent:0;mso-height-percent:0;mso-width-relative:margin;mso-height-relative:margin;v-text-anchor:middle" o:gfxdata="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" fillcolor="white [3212]" stroked="f" strokeweight="2pt">
                 <w10:wrap anchory="page"/>
@@ -368,7 +368,7 @@
                     </wp:inline>
                   </w:drawing>
                 </mc:Choice>
-                <mc:Fallback xmlns:oel="http://schemas.microsoft.com/office/2019/extlst">
+                <mc:Fallback xmlns:oel="http://schemas.microsoft.com/office/2019/extlst" xmlns:w16sdtdh="http://schemas.microsoft.com/office/word/2020/wordml/sdtdatahash" xmlns:w16="http://schemas.microsoft.com/office/word/2018/wordml" xmlns:w16cex="http://schemas.microsoft.com/office/word/2018/wordml/cex">
                   <w:pict>
                     <v:line w14:anchorId="3C7809CC" id="Conector recto 5" o:spid="_x0000_s1026" alt="divisor de texto" style="visibility:visible;mso-wrap-style:square;mso-left-percent:-10001;mso-top-percent:-10001;mso-position-horizontal:absolute;mso-position-horizontal-relative:char;mso-position-vertical:absolute;mso-position-vertical-relative:line;mso-left-percent:-10001;mso-top-percent:-10001" from="0,0" to="109.5pt,0" o:gfxdata="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" strokecolor="#082a75 [3215]" strokeweight="3pt">
                       <w10:anchorlock/>
@@ -470,7 +470,7 @@
                     <w:noProof/>
                     <w:lang w:bidi="es-ES"/>
                   </w:rPr>
-                  <w:t>26 abril</w:t>
+                  <w:t>15 mayo</w:t>
                 </w:r>
                 <w:r>
                   <w:rPr>
@@ -546,7 +546,7 @@
                     </wp:inline>
                   </w:drawing>
                 </mc:Choice>
-                <mc:Fallback xmlns:oel="http://schemas.microsoft.com/office/2019/extlst">
+                <mc:Fallback xmlns:oel="http://schemas.microsoft.com/office/2019/extlst" xmlns:w16sdtdh="http://schemas.microsoft.com/office/word/2020/wordml/sdtdatahash" xmlns:w16="http://schemas.microsoft.com/office/word/2018/wordml" xmlns:w16cex="http://schemas.microsoft.com/office/word/2018/wordml/cex">
                   <w:pict>
                     <v:line w14:anchorId="2EAC2734" id="Conector recto 6" o:spid="_x0000_s1026" alt="divisor de texto" style="visibility:visible;mso-wrap-style:square;mso-left-percent:-10001;mso-top-percent:-10001;mso-position-horizontal:absolute;mso-position-horizontal-relative:char;mso-position-vertical:absolute;mso-position-vertical-relative:line;mso-left-percent:-10001;mso-top-percent:-10001" from="0,0" to="117.65pt,0" o:gfxdata="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" strokecolor="#082a75 [3215]" strokeweight="3pt">
                       <w10:anchorlock/>
@@ -639,24 +639,13 @@
                 <w15:appearance w15:val="hidden"/>
                 <w:text w:multiLine="1"/>
               </w:sdtPr>
+              <w:sdtEndPr/>
               <w:sdtContent>
                 <w:r>
                   <w:rPr>
                     <w:noProof/>
                   </w:rPr>
-                  <w:t xml:space="preserve"> </w:t>
-                </w:r>
-                <w:r>
-                  <w:rPr>
-                    <w:noProof/>
-                  </w:rPr>
-                  <w:t>Robert Cerón, David Solís, Juan José Castro</w:t>
-                </w:r>
-                <w:r>
-                  <w:rPr>
-                    <w:noProof/>
-                  </w:rPr>
-                  <w:t xml:space="preserve"> </w:t>
+                  <w:t xml:space="preserve"> Robert Cerón, David Solís, Juan José Castro </w:t>
                 </w:r>
               </w:sdtContent>
             </w:sdt>
@@ -822,7 +811,7 @@
               </wp:anchor>
             </w:drawing>
           </mc:Choice>
-          <mc:Fallback xmlns:oel="http://schemas.microsoft.com/office/2019/extlst">
+          <mc:Fallback xmlns:oel="http://schemas.microsoft.com/office/2019/extlst" xmlns:w16sdtdh="http://schemas.microsoft.com/office/word/2020/wordml/sdtdatahash" xmlns:w16="http://schemas.microsoft.com/office/word/2018/wordml" xmlns:w16cex="http://schemas.microsoft.com/office/word/2018/wordml/cex">
             <w:pict>
               <v:rect w14:anchorId="5A3CD8EB" id="Rectángulo 2" o:spid="_x0000_s1026" alt="rectángulo de color" style="position:absolute;margin-left:-58.7pt;margin-top:525pt;width:611.1pt;height:316.5pt;z-index:-251657216;visibility:visible;mso-wrap-style:square;mso-height-percent:0;mso-wrap-distance-left:9pt;mso-wrap-distance-top:0;mso-wrap-distance-right:9pt;mso-wrap-distance-bottom:0;mso-position-horizontal:absolute;mso-position-horizontal-relative:text;mso-position-vertical:absolute;mso-position-vertical-relative:page;mso-height-percent:0;mso-height-relative:margin;v-text-anchor:middle" o:gfxdata="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" fillcolor="#34aba2 [3206]" stroked="f" strokeweight="2pt">
                 <w10:wrap anchory="page"/>
@@ -945,8 +934,10 @@
           <w:numId w:val="3"/>
         </w:numPr>
       </w:pPr>
-      <w:r>
-        <w:t>Plataforma de tienda en línea con carrito de compras y pago seguros</w:t>
+      <w:bookmarkStart w:id="0" w:name="_GoBack"/>
+      <w:bookmarkEnd w:id="0"/>
+      <w:r>
+        <w:t>Gestión de clientes</w:t>
       </w:r>
     </w:p>
     <w:p>
@@ -958,7 +949,7 @@
         </w:numPr>
       </w:pPr>
       <w:r>
-        <w:t>Gestión de clientes</w:t>
+        <w:t>Generación de reportes administrativos y estratégicos</w:t>
       </w:r>
     </w:p>
     <w:p>
@@ -970,7 +961,7 @@
         </w:numPr>
       </w:pPr>
       <w:r>
-        <w:t>Generación de reportes administrativos y estratégicos</w:t>
+        <w:t>Sistema de búsqueda avanzada de productos</w:t>
       </w:r>
     </w:p>
     <w:p>
@@ -982,18 +973,6 @@
         </w:numPr>
       </w:pPr>
       <w:r>
-        <w:t>Sistema de búsqueda avanzada de productos</w:t>
-      </w:r>
-    </w:p>
-    <w:p>
-      <w:pPr>
-        <w:pStyle w:val="Contenido"/>
-        <w:numPr>
-          <w:ilvl w:val="0"/>
-          <w:numId w:val="3"/>
-        </w:numPr>
-      </w:pPr>
-      <w:r>
         <w:t>Módulo de gestión de promociones y descuentos</w:t>
       </w:r>
     </w:p>
@@ -1050,7 +1029,15 @@
         </w:numPr>
       </w:pPr>
       <w:r>
-        <w:t>Permitir compras en línea mediane carrito de compras y pagos seguros</w:t>
+        <w:t xml:space="preserve">Permitir compras en línea </w:t>
+      </w:r>
+      <w:proofErr w:type="spellStart"/>
+      <w:r>
+        <w:t>mediane</w:t>
+      </w:r>
+      <w:proofErr w:type="spellEnd"/>
+      <w:r>
+        <w:t xml:space="preserve"> carrito de compras y pagos seguros</w:t>
       </w:r>
     </w:p>
     <w:p>
@@ -1176,7 +1163,23 @@
           <w:b/>
           <w:bCs/>
         </w:rPr>
-        <w:t>Producto Owner:</w:t>
+        <w:t xml:space="preserve">Producto </w:t>
+      </w:r>
+      <w:proofErr w:type="spellStart"/>
+      <w:r>
+        <w:rPr>
+          <w:b/>
+          <w:bCs/>
+        </w:rPr>
+        <w:t>Owner</w:t>
+      </w:r>
+      <w:proofErr w:type="spellEnd"/>
+      <w:r>
+        <w:rPr>
+          <w:b/>
+          <w:bCs/>
+        </w:rPr>
+        <w:t>:</w:t>
       </w:r>
       <w:r>
         <w:t xml:space="preserve"> </w:t>
@@ -1223,7 +1226,23 @@
           <w:b/>
           <w:bCs/>
         </w:rPr>
-        <w:t>Scrum Team:</w:t>
+        <w:t xml:space="preserve">Scrum </w:t>
+      </w:r>
+      <w:proofErr w:type="spellStart"/>
+      <w:r>
+        <w:rPr>
+          <w:b/>
+          <w:bCs/>
+        </w:rPr>
+        <w:t>Team</w:t>
+      </w:r>
+      <w:proofErr w:type="spellEnd"/>
+      <w:r>
+        <w:rPr>
+          <w:b/>
+          <w:bCs/>
+        </w:rPr>
+        <w:t>:</w:t>
       </w:r>
       <w:r>
         <w:rPr>
@@ -1236,7 +1255,21 @@
         <w:rPr>
           <w:lang w:val="en-US"/>
         </w:rPr>
-        <w:t>Robert Cerón, David Solís, Juan José Castro</w:t>
+        <w:t xml:space="preserve">Robert </w:t>
+      </w:r>
+      <w:proofErr w:type="spellStart"/>
+      <w:r>
+        <w:rPr>
+          <w:lang w:val="en-US"/>
+        </w:rPr>
+        <w:t>Cerón</w:t>
+      </w:r>
+      <w:proofErr w:type="spellEnd"/>
+      <w:r>
+        <w:rPr>
+          <w:lang w:val="en-US"/>
+        </w:rPr>
+        <w:t>, David Solís, Juan José Castro</w:t>
       </w:r>
     </w:p>
     <w:p>
@@ -1322,16 +1355,16 @@
           <w:numId w:val="1"/>
         </w:numPr>
       </w:pPr>
+      <w:proofErr w:type="spellStart"/>
       <w:r>
         <w:rPr>
           <w:b/>
           <w:bCs/>
         </w:rPr>
-        <w:t>Tester:</w:t>
-      </w:r>
-      <w:r>
-        <w:t xml:space="preserve"> </w:t>
-      </w:r>
+        <w:t>Tester</w:t>
+      </w:r>
+      <w:proofErr w:type="spellEnd"/>
+      <w:proofErr w:type="gramStart"/>
       <w:r>
         <w:rPr>
           <w:b/>
@@ -1339,6 +1372,17 @@
         </w:rPr>
         <w:t>:</w:t>
       </w:r>
+      <w:r>
+        <w:t xml:space="preserve"> </w:t>
+      </w:r>
+      <w:r>
+        <w:rPr>
+          <w:b/>
+          <w:bCs/>
+        </w:rPr>
+        <w:t>:</w:t>
+      </w:r>
+      <w:proofErr w:type="gramEnd"/>
       <w:r>
         <w:t xml:space="preserve"> David Solís</w:t>
       </w:r>
@@ -1373,12 +1417,21 @@
           <w:numId w:val="1"/>
         </w:numPr>
       </w:pPr>
+      <w:proofErr w:type="spellStart"/>
       <w:r>
         <w:rPr>
           <w:b/>
           <w:bCs/>
         </w:rPr>
-        <w:t>Team lead:</w:t>
+        <w:t>Team</w:t>
+      </w:r>
+      <w:proofErr w:type="spellEnd"/>
+      <w:r>
+        <w:rPr>
+          <w:b/>
+          <w:bCs/>
+        </w:rPr>
+        <w:t xml:space="preserve"> lead:</w:t>
       </w:r>
       <w:r>
         <w:t xml:space="preserve"> </w:t>
@@ -1400,7 +1453,23 @@
           <w:b/>
           <w:bCs/>
         </w:rPr>
-        <w:t>Desarrolladores back end:</w:t>
+        <w:t xml:space="preserve">Desarrolladores back </w:t>
+      </w:r>
+      <w:proofErr w:type="spellStart"/>
+      <w:r>
+        <w:rPr>
+          <w:b/>
+          <w:bCs/>
+        </w:rPr>
+        <w:t>end</w:t>
+      </w:r>
+      <w:proofErr w:type="spellEnd"/>
+      <w:r>
+        <w:rPr>
+          <w:b/>
+          <w:bCs/>
+        </w:rPr>
+        <w:t>:</w:t>
       </w:r>
       <w:r>
         <w:t xml:space="preserve"> </w:t>
@@ -1409,7 +1478,21 @@
         <w:rPr>
           <w:lang w:val="en-US"/>
         </w:rPr>
-        <w:t xml:space="preserve">Robert Cerón, David Solís. </w:t>
+        <w:t xml:space="preserve">Robert </w:t>
+      </w:r>
+      <w:proofErr w:type="spellStart"/>
+      <w:r>
+        <w:rPr>
+          <w:lang w:val="en-US"/>
+        </w:rPr>
+        <w:t>Cerón</w:t>
+      </w:r>
+      <w:proofErr w:type="spellEnd"/>
+      <w:r>
+        <w:rPr>
+          <w:lang w:val="en-US"/>
+        </w:rPr>
+        <w:t xml:space="preserve">, David Solís. </w:t>
       </w:r>
       <w:r>
         <w:t>Juan Castro</w:t>
@@ -1438,7 +1521,23 @@
           <w:bCs/>
         </w:rPr>
         <w:lastRenderedPageBreak/>
-        <w:t>Desarrolladores Front End:</w:t>
+        <w:t xml:space="preserve">Desarrolladores Front </w:t>
+      </w:r>
+      <w:proofErr w:type="spellStart"/>
+      <w:r>
+        <w:rPr>
+          <w:b/>
+          <w:bCs/>
+        </w:rPr>
+        <w:t>End</w:t>
+      </w:r>
+      <w:proofErr w:type="spellEnd"/>
+      <w:r>
+        <w:rPr>
+          <w:b/>
+          <w:bCs/>
+        </w:rPr>
+        <w:t>:</w:t>
       </w:r>
       <w:r>
         <w:t xml:space="preserve"> </w:t>
@@ -2199,9 +2298,14 @@
       <w:pPr>
         <w:pStyle w:val="Ttulo1"/>
       </w:pPr>
+      <w:proofErr w:type="spellStart"/>
       <w:r>
         <w:lastRenderedPageBreak/>
-        <w:t>Product Backlog</w:t>
+        <w:t>Product</w:t>
+      </w:r>
+      <w:proofErr w:type="spellEnd"/>
+      <w:r>
+        <w:t xml:space="preserve"> Backlog</w:t>
       </w:r>
     </w:p>
     <w:tbl>
@@ -2988,7 +3092,15 @@
               <w:cnfStyle w:val="000000100000" w:firstRow="0" w:lastRow="0" w:firstColumn="0" w:lastColumn="0" w:oddVBand="0" w:evenVBand="0" w:oddHBand="1" w:evenHBand="0" w:firstRowFirstColumn="0" w:firstRowLastColumn="0" w:lastRowFirstColumn="0" w:lastRowLastColumn="0"/>
             </w:pPr>
             <w:r>
-              <w:t>Garantizar que no existan errores de disponibilidad (overselling), manteniendo la integridad de los datos de inventario en todos los canales</w:t>
+              <w:t>Garantizar que no existan errores de disponibilidad (</w:t>
+            </w:r>
+            <w:proofErr w:type="spellStart"/>
+            <w:r>
+              <w:t>overselling</w:t>
+            </w:r>
+            <w:proofErr w:type="spellEnd"/>
+            <w:r>
+              <w:t>), manteniendo la integridad de los datos de inventario en todos los canales</w:t>
             </w:r>
           </w:p>
         </w:tc>
@@ -4781,7 +4893,21 @@
               <w:rPr>
                 <w:sz w:val="22"/>
               </w:rPr>
-              <w:t>Ingresa el nombre de un libro en la barra de búsqueda y presiona "Enter"</w:t>
+              <w:t>Ingresa el nombre de un libro en la barra de búsqueda y presiona "</w:t>
+            </w:r>
+            <w:proofErr w:type="spellStart"/>
+            <w:r>
+              <w:rPr>
+                <w:sz w:val="22"/>
+              </w:rPr>
+              <w:t>Enter</w:t>
+            </w:r>
+            <w:proofErr w:type="spellEnd"/>
+            <w:r>
+              <w:rPr>
+                <w:sz w:val="22"/>
+              </w:rPr>
+              <w:t>"</w:t>
             </w:r>
           </w:p>
         </w:tc>
@@ -6139,8 +6265,13 @@
         <w:pStyle w:val="Ttulo2"/>
       </w:pPr>
       <w:r>
-        <w:t>Sprint Review</w:t>
-      </w:r>
+        <w:t xml:space="preserve">Sprint </w:t>
+      </w:r>
+      <w:proofErr w:type="spellStart"/>
+      <w:r>
+        <w:t>Review</w:t>
+      </w:r>
+      <w:proofErr w:type="spellEnd"/>
     </w:p>
     <w:p>
       <w:pPr>
@@ -6215,9 +6346,14 @@
       <w:pPr>
         <w:pStyle w:val="Ttulo2"/>
       </w:pPr>
+      <w:proofErr w:type="spellStart"/>
       <w:r>
         <w:lastRenderedPageBreak/>
-        <w:t>Product Backlog Actualizado</w:t>
+        <w:t>Product</w:t>
+      </w:r>
+      <w:proofErr w:type="spellEnd"/>
+      <w:r>
+        <w:t xml:space="preserve"> Backlog Actualizado</w:t>
       </w:r>
     </w:p>
     <w:tbl>
@@ -7579,7 +7715,23 @@
                 <w:sz w:val="22"/>
                 <w:lang w:val="es-CO" w:eastAsia="es-CO"/>
               </w:rPr>
-              <w:t>Un sistema de selección de productos y checkout seguro</w:t>
+              <w:t xml:space="preserve">Un sistema de selección de productos y </w:t>
+            </w:r>
+            <w:proofErr w:type="spellStart"/>
+            <w:r>
+              <w:rPr>
+                <w:sz w:val="22"/>
+                <w:lang w:val="es-CO" w:eastAsia="es-CO"/>
+              </w:rPr>
+              <w:t>checkout</w:t>
+            </w:r>
+            <w:proofErr w:type="spellEnd"/>
+            <w:r>
+              <w:rPr>
+                <w:sz w:val="22"/>
+                <w:lang w:val="es-CO" w:eastAsia="es-CO"/>
+              </w:rPr>
+              <w:t xml:space="preserve"> seguro</w:t>
             </w:r>
           </w:p>
         </w:tc>
@@ -9177,8 +9329,13 @@
         <w:pStyle w:val="Ttulo2"/>
       </w:pPr>
       <w:r>
-        <w:t>Sprint Review</w:t>
-      </w:r>
+        <w:t xml:space="preserve">Sprint </w:t>
+      </w:r>
+      <w:proofErr w:type="spellStart"/>
+      <w:r>
+        <w:t>Review</w:t>
+      </w:r>
+      <w:proofErr w:type="spellEnd"/>
     </w:p>
     <w:p>
       <w:pPr>
@@ -9254,9 +9411,14 @@
       <w:pPr>
         <w:pStyle w:val="Ttulo2"/>
       </w:pPr>
+      <w:proofErr w:type="spellStart"/>
       <w:r>
         <w:lastRenderedPageBreak/>
-        <w:t>Product Backlog Actualizado</w:t>
+        <w:t>Product</w:t>
+      </w:r>
+      <w:proofErr w:type="spellEnd"/>
+      <w:r>
+        <w:t xml:space="preserve"> Backlog Actualizado</w:t>
       </w:r>
     </w:p>
     <w:tbl>
@@ -12217,8 +12379,13 @@
       </w:pPr>
       <w:r>
         <w:lastRenderedPageBreak/>
-        <w:t>Sprint Review</w:t>
-      </w:r>
+        <w:t xml:space="preserve">Sprint </w:t>
+      </w:r>
+      <w:proofErr w:type="spellStart"/>
+      <w:r>
+        <w:t>Review</w:t>
+      </w:r>
+      <w:proofErr w:type="spellEnd"/>
     </w:p>
     <w:p>
       <w:pPr>
@@ -12293,9 +12460,14 @@
       <w:pPr>
         <w:pStyle w:val="Ttulo2"/>
       </w:pPr>
+      <w:proofErr w:type="spellStart"/>
       <w:r>
         <w:lastRenderedPageBreak/>
-        <w:t>Product Backlog Actualizado</w:t>
+        <w:t>Product</w:t>
+      </w:r>
+      <w:proofErr w:type="spellEnd"/>
+      <w:r>
+        <w:t xml:space="preserve"> Backlog Actualizado</w:t>
       </w:r>
     </w:p>
     <w:tbl>
@@ -15332,8 +15504,13 @@
         <w:pStyle w:val="Ttulo2"/>
       </w:pPr>
       <w:r>
-        <w:t>Sprint Review</w:t>
-      </w:r>
+        <w:t xml:space="preserve">Sprint </w:t>
+      </w:r>
+      <w:proofErr w:type="spellStart"/>
+      <w:r>
+        <w:t>Review</w:t>
+      </w:r>
+      <w:proofErr w:type="spellEnd"/>
     </w:p>
     <w:p>
       <w:pPr>
@@ -15409,9 +15586,14 @@
       <w:pPr>
         <w:pStyle w:val="Ttulo2"/>
       </w:pPr>
+      <w:proofErr w:type="spellStart"/>
       <w:r>
         <w:lastRenderedPageBreak/>
-        <w:t>Product Backlog Actualizado</w:t>
+        <w:t>Product</w:t>
+      </w:r>
+      <w:proofErr w:type="spellEnd"/>
+      <w:r>
+        <w:t xml:space="preserve"> Backlog Actualizado</w:t>
       </w:r>
     </w:p>
     <w:tbl>
@@ -15845,7 +16027,7 @@
 </file>
 
 <file path=word/endnotes.xml><?xml version="1.0" encoding="utf-8"?>
-<w:endnotes xmlns:wpc="http://schemas.microsoft.com/office/word/2010/wordprocessingCanvas" xmlns:cx="http://schemas.microsoft.com/office/drawing/2014/chartex" xmlns:cx1="http://schemas.microsoft.com/office/drawing/2015/9/8/chartex" xmlns:cx2="http://schemas.microsoft.com/office/drawing/2015/10/21/chartex" xmlns:cx3="http://schemas.microsoft.com/office/drawing/2016/5/9/chartex" xmlns:cx4="http://schemas.microsoft.com/office/drawing/2016/5/10/chartex" xmlns:cx5="http://schemas.microsoft.com/office/drawing/2016/5/11/chartex" xmlns:cx6="http://schemas.microsoft.com/office/drawing/2016/5/12/chartex" xmlns:cx7="http://schemas.microsoft.com/office/drawing/2016/5/13/chartex" xmlns:cx8="http://schemas.microsoft.com/office/drawing/2016/5/14/chartex" xmlns:mc="http://schemas.openxmlformats.org/markup-compatibility/2006" xmlns:aink="http://schemas.microsoft.com/office/drawing/2016/ink" xmlns:am3d="http://schemas.microsoft.com/office/drawing/2017/model3d" xmlns:o="urn:schemas-microsoft-com:office:office" xmlns:r="http://schemas.openxmlformats.org/officeDocument/2006/relationships" xmlns:m="http://schemas.openxmlformats.org/officeDocument/2006/math" xmlns:v="urn:schemas-microsoft-com:vml" xmlns:wp14="http://schemas.microsoft.com/office/word/2010/wordprocessingDrawing" xmlns:wp="http://schemas.openxmlformats.org/drawingml/2006/wordprocessingDrawing" xmlns:w10="urn:schemas-microsoft-com:office:word" xmlns:w="http://schemas.openxmlformats.org/wordprocessingml/2006/main" xmlns:w14="http://schemas.microsoft.com/office/word/2010/wordml" xmlns:w15="http://schemas.microsoft.com/office/word/2012/wordml" xmlns:w16cex="http://schemas.microsoft.com/office/word/2018/wordml/cex" xmlns:w16cid="http://schemas.microsoft.com/office/word/2016/wordml/cid" xmlns:w16="http://schemas.microsoft.com/office/word/2018/wordml" xmlns:w16sdtdh="http://schemas.microsoft.com/office/word/2020/wordml/sdtdatahash" xmlns:w16se="http://schemas.microsoft.com/office/word/2015/wordml/symex" xmlns:wpg="http://schemas.microsoft.com/office/word/2010/wordprocessingGroup" xmlns:wpi="http://schemas.microsoft.com/office/word/2010/wordprocessingInk" xmlns:wne="http://schemas.microsoft.com/office/word/2006/wordml" xmlns:wps="http://schemas.microsoft.com/office/word/2010/wordprocessingShape" mc:Ignorable="w14 w15 w16se w16cid w16 w16cex w16sdtdh wp14">
+<w:endnotes xmlns:wpc="http://schemas.microsoft.com/office/word/2010/wordprocessingCanvas" xmlns:cx="http://schemas.microsoft.com/office/drawing/2014/chartex" xmlns:cx1="http://schemas.microsoft.com/office/drawing/2015/9/8/chartex" xmlns:cx2="http://schemas.microsoft.com/office/drawing/2015/10/21/chartex" xmlns:cx3="http://schemas.microsoft.com/office/drawing/2016/5/9/chartex" xmlns:cx4="http://schemas.microsoft.com/office/drawing/2016/5/10/chartex" xmlns:cx5="http://schemas.microsoft.com/office/drawing/2016/5/11/chartex" xmlns:cx6="http://schemas.microsoft.com/office/drawing/2016/5/12/chartex" xmlns:cx7="http://schemas.microsoft.com/office/drawing/2016/5/13/chartex" xmlns:cx8="http://schemas.microsoft.com/office/drawing/2016/5/14/chartex" xmlns:mc="http://schemas.openxmlformats.org/markup-compatibility/2006" xmlns:aink="http://schemas.microsoft.com/office/drawing/2016/ink" xmlns:am3d="http://schemas.microsoft.com/office/drawing/2017/model3d" xmlns:o="urn:schemas-microsoft-com:office:office" xmlns:r="http://schemas.openxmlformats.org/officeDocument/2006/relationships" xmlns:m="http://schemas.openxmlformats.org/officeDocument/2006/math" xmlns:v="urn:schemas-microsoft-com:vml" xmlns:wp14="http://schemas.microsoft.com/office/word/2010/wordprocessingDrawing" xmlns:wp="http://schemas.openxmlformats.org/drawingml/2006/wordprocessingDrawing" xmlns:w10="urn:schemas-microsoft-com:office:word" xmlns:w="http://schemas.openxmlformats.org/wordprocessingml/2006/main" xmlns:w14="http://schemas.microsoft.com/office/word/2010/wordml" xmlns:w15="http://schemas.microsoft.com/office/word/2012/wordml" xmlns:w16cid="http://schemas.microsoft.com/office/word/2016/wordml/cid" xmlns:w16se="http://schemas.microsoft.com/office/word/2015/wordml/symex" xmlns:wpg="http://schemas.microsoft.com/office/word/2010/wordprocessingGroup" xmlns:wpi="http://schemas.microsoft.com/office/word/2010/wordprocessingInk" xmlns:wne="http://schemas.microsoft.com/office/word/2006/wordml" xmlns:wps="http://schemas.microsoft.com/office/word/2010/wordprocessingShape" mc:Ignorable="w14 w15 w16se w16cid wp14">
   <w:endnote w:type="separator" w:id="-1">
     <w:p>
       <w:r>
@@ -15866,7 +16048,7 @@
 </file>
 
 <file path=word/footer1.xml><?xml version="1.0" encoding="utf-8"?>
-<w:ftr xmlns:wpc="http://schemas.microsoft.com/office/word/2010/wordprocessingCanvas" xmlns:cx="http://schemas.microsoft.com/office/drawing/2014/chartex" xmlns:cx1="http://schemas.microsoft.com/office/drawing/2015/9/8/chartex" xmlns:cx2="http://schemas.microsoft.com/office/drawing/2015/10/21/chartex" xmlns:cx3="http://schemas.microsoft.com/office/drawing/2016/5/9/chartex" xmlns:cx4="http://schemas.microsoft.com/office/drawing/2016/5/10/chartex" xmlns:cx5="http://schemas.microsoft.com/office/drawing/2016/5/11/chartex" xmlns:cx6="http://schemas.microsoft.com/office/drawing/2016/5/12/chartex" xmlns:cx7="http://schemas.microsoft.com/office/drawing/2016/5/13/chartex" xmlns:cx8="http://schemas.microsoft.com/office/drawing/2016/5/14/chartex" xmlns:mc="http://schemas.openxmlformats.org/markup-compatibility/2006" xmlns:aink="http://schemas.microsoft.com/office/drawing/2016/ink" xmlns:am3d="http://schemas.microsoft.com/office/drawing/2017/model3d" xmlns:o="urn:schemas-microsoft-com:office:office" xmlns:r="http://schemas.openxmlformats.org/officeDocument/2006/relationships" xmlns:m="http://schemas.openxmlformats.org/officeDocument/2006/math" xmlns:v="urn:schemas-microsoft-com:vml" xmlns:wp14="http://schemas.microsoft.com/office/word/2010/wordprocessingDrawing" xmlns:wp="http://schemas.openxmlformats.org/drawingml/2006/wordprocessingDrawing" xmlns:w10="urn:schemas-microsoft-com:office:word" xmlns:w="http://schemas.openxmlformats.org/wordprocessingml/2006/main" xmlns:w14="http://schemas.microsoft.com/office/word/2010/wordml" xmlns:w15="http://schemas.microsoft.com/office/word/2012/wordml" xmlns:w16cex="http://schemas.microsoft.com/office/word/2018/wordml/cex" xmlns:w16cid="http://schemas.microsoft.com/office/word/2016/wordml/cid" xmlns:w16="http://schemas.microsoft.com/office/word/2018/wordml" xmlns:w16sdtdh="http://schemas.microsoft.com/office/word/2020/wordml/sdtdatahash" xmlns:w16se="http://schemas.microsoft.com/office/word/2015/wordml/symex" xmlns:wpg="http://schemas.microsoft.com/office/word/2010/wordprocessingGroup" xmlns:wpi="http://schemas.microsoft.com/office/word/2010/wordprocessingInk" xmlns:wne="http://schemas.microsoft.com/office/word/2006/wordml" xmlns:wps="http://schemas.microsoft.com/office/word/2010/wordprocessingShape" mc:Ignorable="w14 w15 w16se w16cid w16 w16cex w16sdtdh wp14">
+<w:ftr xmlns:wpc="http://schemas.microsoft.com/office/word/2010/wordprocessingCanvas" xmlns:cx="http://schemas.microsoft.com/office/drawing/2014/chartex" xmlns:cx1="http://schemas.microsoft.com/office/drawing/2015/9/8/chartex" xmlns:cx2="http://schemas.microsoft.com/office/drawing/2015/10/21/chartex" xmlns:cx3="http://schemas.microsoft.com/office/drawing/2016/5/9/chartex" xmlns:cx4="http://schemas.microsoft.com/office/drawing/2016/5/10/chartex" xmlns:cx5="http://schemas.microsoft.com/office/drawing/2016/5/11/chartex" xmlns:cx6="http://schemas.microsoft.com/office/drawing/2016/5/12/chartex" xmlns:cx7="http://schemas.microsoft.com/office/drawing/2016/5/13/chartex" xmlns:cx8="http://schemas.microsoft.com/office/drawing/2016/5/14/chartex" xmlns:mc="http://schemas.openxmlformats.org/markup-compatibility/2006" xmlns:aink="http://schemas.microsoft.com/office/drawing/2016/ink" xmlns:am3d="http://schemas.microsoft.com/office/drawing/2017/model3d" xmlns:o="urn:schemas-microsoft-com:office:office" xmlns:r="http://schemas.openxmlformats.org/officeDocument/2006/relationships" xmlns:m="http://schemas.openxmlformats.org/officeDocument/2006/math" xmlns:v="urn:schemas-microsoft-com:vml" xmlns:wp14="http://schemas.microsoft.com/office/word/2010/wordprocessingDrawing" xmlns:wp="http://schemas.openxmlformats.org/drawingml/2006/wordprocessingDrawing" xmlns:w10="urn:schemas-microsoft-com:office:word" xmlns:w="http://schemas.openxmlformats.org/wordprocessingml/2006/main" xmlns:w14="http://schemas.microsoft.com/office/word/2010/wordml" xmlns:w15="http://schemas.microsoft.com/office/word/2012/wordml" xmlns:w16cid="http://schemas.microsoft.com/office/word/2016/wordml/cid" xmlns:w16se="http://schemas.microsoft.com/office/word/2015/wordml/symex" xmlns:wpg="http://schemas.microsoft.com/office/word/2010/wordprocessingGroup" xmlns:wpi="http://schemas.microsoft.com/office/word/2010/wordprocessingInk" xmlns:wne="http://schemas.microsoft.com/office/word/2006/wordml" xmlns:wps="http://schemas.microsoft.com/office/word/2010/wordprocessingShape" mc:Ignorable="w14 w15 w16se w16cid wp14">
   <w:sdt>
     <w:sdtPr>
       <w:rPr>
@@ -15938,7 +16120,7 @@
 </file>
 
 <file path=word/footnotes.xml><?xml version="1.0" encoding="utf-8"?>
-<w:footnotes xmlns:wpc="http://schemas.microsoft.com/office/word/2010/wordprocessingCanvas" xmlns:cx="http://schemas.microsoft.com/office/drawing/2014/chartex" xmlns:cx1="http://schemas.microsoft.com/office/drawing/2015/9/8/chartex" xmlns:cx2="http://schemas.microsoft.com/office/drawing/2015/10/21/chartex" xmlns:cx3="http://schemas.microsoft.com/office/drawing/2016/5/9/chartex" xmlns:cx4="http://schemas.microsoft.com/office/drawing/2016/5/10/chartex" xmlns:cx5="http://schemas.microsoft.com/office/drawing/2016/5/11/chartex" xmlns:cx6="http://schemas.microsoft.com/office/drawing/2016/5/12/chartex" xmlns:cx7="http://schemas.microsoft.com/office/drawing/2016/5/13/chartex" xmlns:cx8="http://schemas.microsoft.com/office/drawing/2016/5/14/chartex" xmlns:mc="http://schemas.openxmlformats.org/markup-compatibility/2006" xmlns:aink="http://schemas.microsoft.com/office/drawing/2016/ink" xmlns:am3d="http://schemas.microsoft.com/office/drawing/2017/model3d" xmlns:o="urn:schemas-microsoft-com:office:office" xmlns:r="http://schemas.openxmlformats.org/officeDocument/2006/relationships" xmlns:m="http://schemas.openxmlformats.org/officeDocument/2006/math" xmlns:v="urn:schemas-microsoft-com:vml" xmlns:wp14="http://schemas.microsoft.com/office/word/2010/wordprocessingDrawing" xmlns:wp="http://schemas.openxmlformats.org/drawingml/2006/wordprocessingDrawing" xmlns:w10="urn:schemas-microsoft-com:office:word" xmlns:w="http://schemas.openxmlformats.org/wordprocessingml/2006/main" xmlns:w14="http://schemas.microsoft.com/office/word/2010/wordml" xmlns:w15="http://schemas.microsoft.com/office/word/2012/wordml" xmlns:w16cex="http://schemas.microsoft.com/office/word/2018/wordml/cex" xmlns:w16cid="http://schemas.microsoft.com/office/word/2016/wordml/cid" xmlns:w16="http://schemas.microsoft.com/office/word/2018/wordml" xmlns:w16sdtdh="http://schemas.microsoft.com/office/word/2020/wordml/sdtdatahash" xmlns:w16se="http://schemas.microsoft.com/office/word/2015/wordml/symex" xmlns:wpg="http://schemas.microsoft.com/office/word/2010/wordprocessingGroup" xmlns:wpi="http://schemas.microsoft.com/office/word/2010/wordprocessingInk" xmlns:wne="http://schemas.microsoft.com/office/word/2006/wordml" xmlns:wps="http://schemas.microsoft.com/office/word/2010/wordprocessingShape" mc:Ignorable="w14 w15 w16se w16cid w16 w16cex w16sdtdh wp14">
+<w:footnotes xmlns:wpc="http://schemas.microsoft.com/office/word/2010/wordprocessingCanvas" xmlns:cx="http://schemas.microsoft.com/office/drawing/2014/chartex" xmlns:cx1="http://schemas.microsoft.com/office/drawing/2015/9/8/chartex" xmlns:cx2="http://schemas.microsoft.com/office/drawing/2015/10/21/chartex" xmlns:cx3="http://schemas.microsoft.com/office/drawing/2016/5/9/chartex" xmlns:cx4="http://schemas.microsoft.com/office/drawing/2016/5/10/chartex" xmlns:cx5="http://schemas.microsoft.com/office/drawing/2016/5/11/chartex" xmlns:cx6="http://schemas.microsoft.com/office/drawing/2016/5/12/chartex" xmlns:cx7="http://schemas.microsoft.com/office/drawing/2016/5/13/chartex" xmlns:cx8="http://schemas.microsoft.com/office/drawing/2016/5/14/chartex" xmlns:mc="http://schemas.openxmlformats.org/markup-compatibility/2006" xmlns:aink="http://schemas.microsoft.com/office/drawing/2016/ink" xmlns:am3d="http://schemas.microsoft.com/office/drawing/2017/model3d" xmlns:o="urn:schemas-microsoft-com:office:office" xmlns:r="http://schemas.openxmlformats.org/officeDocument/2006/relationships" xmlns:m="http://schemas.openxmlformats.org/officeDocument/2006/math" xmlns:v="urn:schemas-microsoft-com:vml" xmlns:wp14="http://schemas.microsoft.com/office/word/2010/wordprocessingDrawing" xmlns:wp="http://schemas.openxmlformats.org/drawingml/2006/wordprocessingDrawing" xmlns:w10="urn:schemas-microsoft-com:office:word" xmlns:w="http://schemas.openxmlformats.org/wordprocessingml/2006/main" xmlns:w14="http://schemas.microsoft.com/office/word/2010/wordml" xmlns:w15="http://schemas.microsoft.com/office/word/2012/wordml" xmlns:w16cid="http://schemas.microsoft.com/office/word/2016/wordml/cid" xmlns:w16se="http://schemas.microsoft.com/office/word/2015/wordml/symex" xmlns:wpg="http://schemas.microsoft.com/office/word/2010/wordprocessingGroup" xmlns:wpi="http://schemas.microsoft.com/office/word/2010/wordprocessingInk" xmlns:wne="http://schemas.microsoft.com/office/word/2006/wordml" xmlns:wps="http://schemas.microsoft.com/office/word/2010/wordprocessingShape" mc:Ignorable="w14 w15 w16se w16cid wp14">
   <w:footnote w:type="separator" w:id="-1">
     <w:p>
       <w:r>
@@ -15959,7 +16141,7 @@
 </file>
 
 <file path=word/header1.xml><?xml version="1.0" encoding="utf-8"?>
-<w:hdr xmlns:wpc="http://schemas.microsoft.com/office/word/2010/wordprocessingCanvas" xmlns:cx="http://schemas.microsoft.com/office/drawing/2014/chartex" xmlns:cx1="http://schemas.microsoft.com/office/drawing/2015/9/8/chartex" xmlns:cx2="http://schemas.microsoft.com/office/drawing/2015/10/21/chartex" xmlns:cx3="http://schemas.microsoft.com/office/drawing/2016/5/9/chartex" xmlns:cx4="http://schemas.microsoft.com/office/drawing/2016/5/10/chartex" xmlns:cx5="http://schemas.microsoft.com/office/drawing/2016/5/11/chartex" xmlns:cx6="http://schemas.microsoft.com/office/drawing/2016/5/12/chartex" xmlns:cx7="http://schemas.microsoft.com/office/drawing/2016/5/13/chartex" xmlns:cx8="http://schemas.microsoft.com/office/drawing/2016/5/14/chartex" xmlns:mc="http://schemas.openxmlformats.org/markup-compatibility/2006" xmlns:aink="http://schemas.microsoft.com/office/drawing/2016/ink" xmlns:am3d="http://schemas.microsoft.com/office/drawing/2017/model3d" xmlns:o="urn:schemas-microsoft-com:office:office" xmlns:r="http://schemas.openxmlformats.org/officeDocument/2006/relationships" xmlns:m="http://schemas.openxmlformats.org/officeDocument/2006/math" xmlns:v="urn:schemas-microsoft-com:vml" xmlns:wp14="http://schemas.microsoft.com/office/word/2010/wordprocessingDrawing" xmlns:wp="http://schemas.openxmlformats.org/drawingml/2006/wordprocessingDrawing" xmlns:w10="urn:schemas-microsoft-com:office:word" xmlns:w="http://schemas.openxmlformats.org/wordprocessingml/2006/main" xmlns:w14="http://schemas.microsoft.com/office/word/2010/wordml" xmlns:w15="http://schemas.microsoft.com/office/word/2012/wordml" xmlns:w16cex="http://schemas.microsoft.com/office/word/2018/wordml/cex" xmlns:w16cid="http://schemas.microsoft.com/office/word/2016/wordml/cid" xmlns:w16="http://schemas.microsoft.com/office/word/2018/wordml" xmlns:w16sdtdh="http://schemas.microsoft.com/office/word/2020/wordml/sdtdatahash" xmlns:w16se="http://schemas.microsoft.com/office/word/2015/wordml/symex" xmlns:wpg="http://schemas.microsoft.com/office/word/2010/wordprocessingGroup" xmlns:wpi="http://schemas.microsoft.com/office/word/2010/wordprocessingInk" xmlns:wne="http://schemas.microsoft.com/office/word/2006/wordml" xmlns:wps="http://schemas.microsoft.com/office/word/2010/wordprocessingShape" mc:Ignorable="w14 w15 w16se w16cid w16 w16cex w16sdtdh wp14">
+<w:hdr xmlns:wpc="http://schemas.microsoft.com/office/word/2010/wordprocessingCanvas" xmlns:cx="http://schemas.microsoft.com/office/drawing/2014/chartex" xmlns:cx1="http://schemas.microsoft.com/office/drawing/2015/9/8/chartex" xmlns:cx2="http://schemas.microsoft.com/office/drawing/2015/10/21/chartex" xmlns:cx3="http://schemas.microsoft.com/office/drawing/2016/5/9/chartex" xmlns:cx4="http://schemas.microsoft.com/office/drawing/2016/5/10/chartex" xmlns:cx5="http://schemas.microsoft.com/office/drawing/2016/5/11/chartex" xmlns:cx6="http://schemas.microsoft.com/office/drawing/2016/5/12/chartex" xmlns:cx7="http://schemas.microsoft.com/office/drawing/2016/5/13/chartex" xmlns:cx8="http://schemas.microsoft.com/office/drawing/2016/5/14/chartex" xmlns:mc="http://schemas.openxmlformats.org/markup-compatibility/2006" xmlns:aink="http://schemas.microsoft.com/office/drawing/2016/ink" xmlns:am3d="http://schemas.microsoft.com/office/drawing/2017/model3d" xmlns:o="urn:schemas-microsoft-com:office:office" xmlns:r="http://schemas.openxmlformats.org/officeDocument/2006/relationships" xmlns:m="http://schemas.openxmlformats.org/officeDocument/2006/math" xmlns:v="urn:schemas-microsoft-com:vml" xmlns:wp14="http://schemas.microsoft.com/office/word/2010/wordprocessingDrawing" xmlns:wp="http://schemas.openxmlformats.org/drawingml/2006/wordprocessingDrawing" xmlns:w10="urn:schemas-microsoft-com:office:word" xmlns:w="http://schemas.openxmlformats.org/wordprocessingml/2006/main" xmlns:w14="http://schemas.microsoft.com/office/word/2010/wordml" xmlns:w15="http://schemas.microsoft.com/office/word/2012/wordml" xmlns:w16cid="http://schemas.microsoft.com/office/word/2016/wordml/cid" xmlns:w16se="http://schemas.microsoft.com/office/word/2015/wordml/symex" xmlns:wpg="http://schemas.microsoft.com/office/word/2010/wordprocessingGroup" xmlns:wpi="http://schemas.microsoft.com/office/word/2010/wordprocessingInk" xmlns:wne="http://schemas.microsoft.com/office/word/2006/wordml" xmlns:wps="http://schemas.microsoft.com/office/word/2010/wordprocessingShape" mc:Ignorable="w14 w15 w16se w16cid wp14">
   <w:tbl>
     <w:tblPr>
       <w:tblW w:w="10035" w:type="dxa"/>
@@ -16013,7 +16195,7 @@
 </file>
 
 <file path=word/numbering.xml><?xml version="1.0" encoding="utf-8"?>
-<w:numbering xmlns:wpc="http://schemas.microsoft.com/office/word/2010/wordprocessingCanvas" xmlns:cx="http://schemas.microsoft.com/office/drawing/2014/chartex" xmlns:cx1="http://schemas.microsoft.com/office/drawing/2015/9/8/chartex" xmlns:cx2="http://schemas.microsoft.com/office/drawing/2015/10/21/chartex" xmlns:cx3="http://schemas.microsoft.com/office/drawing/2016/5/9/chartex" xmlns:cx4="http://schemas.microsoft.com/office/drawing/2016/5/10/chartex" xmlns:cx5="http://schemas.microsoft.com/office/drawing/2016/5/11/chartex" xmlns:cx6="http://schemas.microsoft.com/office/drawing/2016/5/12/chartex" xmlns:cx7="http://schemas.microsoft.com/office/drawing/2016/5/13/chartex" xmlns:cx8="http://schemas.microsoft.com/office/drawing/2016/5/14/chartex" xmlns:mc="http://schemas.openxmlformats.org/markup-compatibility/2006" xmlns:aink="http://schemas.microsoft.com/office/drawing/2016/ink" xmlns:am3d="http://schemas.microsoft.com/office/drawing/2017/model3d" xmlns:o="urn:schemas-microsoft-com:office:office" xmlns:r="http://schemas.openxmlformats.org/officeDocument/2006/relationships" xmlns:m="http://schemas.openxmlformats.org/officeDocument/2006/math" xmlns:v="urn:schemas-microsoft-com:vml" xmlns:wp14="http://schemas.microsoft.com/office/word/2010/wordprocessingDrawing" xmlns:wp="http://schemas.openxmlformats.org/drawingml/2006/wordprocessingDrawing" xmlns:w10="urn:schemas-microsoft-com:office:word" xmlns:w="http://schemas.openxmlformats.org/wordprocessingml/2006/main" xmlns:w14="http://schemas.microsoft.com/office/word/2010/wordml" xmlns:w15="http://schemas.microsoft.com/office/word/2012/wordml" xmlns:w16cex="http://schemas.microsoft.com/office/word/2018/wordml/cex" xmlns:w16cid="http://schemas.microsoft.com/office/word/2016/wordml/cid" xmlns:w16="http://schemas.microsoft.com/office/word/2018/wordml" xmlns:w16sdtdh="http://schemas.microsoft.com/office/word/2020/wordml/sdtdatahash" xmlns:w16se="http://schemas.microsoft.com/office/word/2015/wordml/symex" xmlns:wpg="http://schemas.microsoft.com/office/word/2010/wordprocessingGroup" xmlns:wpi="http://schemas.microsoft.com/office/word/2010/wordprocessingInk" xmlns:wne="http://schemas.microsoft.com/office/word/2006/wordml" xmlns:wps="http://schemas.microsoft.com/office/word/2010/wordprocessingShape" mc:Ignorable="w14 w15 w16se w16cid w16 w16cex w16sdtdh wp14">
+<w:numbering xmlns:wpc="http://schemas.microsoft.com/office/word/2010/wordprocessingCanvas" xmlns:cx="http://schemas.microsoft.com/office/drawing/2014/chartex" xmlns:cx1="http://schemas.microsoft.com/office/drawing/2015/9/8/chartex" xmlns:cx2="http://schemas.microsoft.com/office/drawing/2015/10/21/chartex" xmlns:cx3="http://schemas.microsoft.com/office/drawing/2016/5/9/chartex" xmlns:cx4="http://schemas.microsoft.com/office/drawing/2016/5/10/chartex" xmlns:cx5="http://schemas.microsoft.com/office/drawing/2016/5/11/chartex" xmlns:cx6="http://schemas.microsoft.com/office/drawing/2016/5/12/chartex" xmlns:cx7="http://schemas.microsoft.com/office/drawing/2016/5/13/chartex" xmlns:cx8="http://schemas.microsoft.com/office/drawing/2016/5/14/chartex" xmlns:mc="http://schemas.openxmlformats.org/markup-compatibility/2006" xmlns:aink="http://schemas.microsoft.com/office/drawing/2016/ink" xmlns:am3d="http://schemas.microsoft.com/office/drawing/2017/model3d" xmlns:o="urn:schemas-microsoft-com:office:office" xmlns:r="http://schemas.openxmlformats.org/officeDocument/2006/relationships" xmlns:m="http://schemas.openxmlformats.org/officeDocument/2006/math" xmlns:v="urn:schemas-microsoft-com:vml" xmlns:wp14="http://schemas.microsoft.com/office/word/2010/wordprocessingDrawing" xmlns:wp="http://schemas.openxmlformats.org/drawingml/2006/wordprocessingDrawing" xmlns:w10="urn:schemas-microsoft-com:office:word" xmlns:w="http://schemas.openxmlformats.org/wordprocessingml/2006/main" xmlns:w14="http://schemas.microsoft.com/office/word/2010/wordml" xmlns:w15="http://schemas.microsoft.com/office/word/2012/wordml" xmlns:w16cid="http://schemas.microsoft.com/office/word/2016/wordml/cid" xmlns:w16se="http://schemas.microsoft.com/office/word/2015/wordml/symex" xmlns:wpg="http://schemas.microsoft.com/office/word/2010/wordprocessingGroup" xmlns:wpi="http://schemas.microsoft.com/office/word/2010/wordprocessingInk" xmlns:wne="http://schemas.microsoft.com/office/word/2006/wordml" xmlns:wps="http://schemas.microsoft.com/office/word/2010/wordprocessingShape" mc:Ignorable="w14 w15 w16se w16cid wp14">
   <w:abstractNum w:abstractNumId="0" w15:restartNumberingAfterBreak="0">
     <w:nsid w:val="34F278CF"/>
     <w:multiLevelType w:val="hybridMultilevel"/>
@@ -16243,7 +16425,7 @@
   <w:abstractNum w:abstractNumId="2" w15:restartNumberingAfterBreak="0">
     <w:nsid w:val="507F5E30"/>
     <w:multiLevelType w:val="hybridMultilevel"/>
-    <w:tmpl w:val="4EA8DDE2"/>
+    <w:tmpl w:val="7BC83842"/>
     <w:lvl w:ilvl="0" w:tplc="240A0001">
       <w:start w:val="1"/>
       <w:numFmt w:val="bullet"/>
@@ -16482,7 +16664,7 @@
 </file>
 
 <file path=word/styles.xml><?xml version="1.0" encoding="utf-8"?>
-<w:styles xmlns:mc="http://schemas.openxmlformats.org/markup-compatibility/2006" xmlns:r="http://schemas.openxmlformats.org/officeDocument/2006/relationships" xmlns:w="http://schemas.openxmlformats.org/wordprocessingml/2006/main" xmlns:w14="http://schemas.microsoft.com/office/word/2010/wordml" xmlns:w15="http://schemas.microsoft.com/office/word/2012/wordml" xmlns:w16cex="http://schemas.microsoft.com/office/word/2018/wordml/cex" xmlns:w16cid="http://schemas.microsoft.com/office/word/2016/wordml/cid" xmlns:w16="http://schemas.microsoft.com/office/word/2018/wordml" xmlns:w16sdtdh="http://schemas.microsoft.com/office/word/2020/wordml/sdtdatahash" xmlns:w16se="http://schemas.microsoft.com/office/word/2015/wordml/symex" mc:Ignorable="w14 w15 w16se w16cid w16 w16cex w16sdtdh">
+<w:styles xmlns:mc="http://schemas.openxmlformats.org/markup-compatibility/2006" xmlns:r="http://schemas.openxmlformats.org/officeDocument/2006/relationships" xmlns:w="http://schemas.openxmlformats.org/wordprocessingml/2006/main" xmlns:w14="http://schemas.microsoft.com/office/word/2010/wordml" xmlns:w15="http://schemas.microsoft.com/office/word/2012/wordml" xmlns:w16cid="http://schemas.microsoft.com/office/word/2016/wordml/cid" xmlns:w16se="http://schemas.microsoft.com/office/word/2015/wordml/symex" mc:Ignorable="w14 w15 w16se w16cid">
   <w:docDefaults>
     <w:rPrDefault>
       <w:rPr>
@@ -16498,7 +16680,7 @@
       </w:pPr>
     </w:pPrDefault>
   </w:docDefaults>
-  <w:latentStyles w:defLockedState="0" w:defUIPriority="99" w:defSemiHidden="0" w:defUnhideWhenUsed="0" w:defQFormat="0" w:count="376">
+  <w:latentStyles w:defLockedState="0" w:defUIPriority="99" w:defSemiHidden="0" w:defUnhideWhenUsed="0" w:defQFormat="0" w:count="375">
     <w:lsdException w:name="Normal" w:uiPriority="0" w:qFormat="1"/>
     <w:lsdException w:name="heading 1" w:uiPriority="7" w:qFormat="1"/>
     <w:lsdException w:name="heading 2" w:uiPriority="4" w:qFormat="1"/>
@@ -16874,7 +17056,6 @@
     <w:lsdException w:name="Smart Hyperlink" w:semiHidden="1" w:unhideWhenUsed="1"/>
     <w:lsdException w:name="Hashtag" w:semiHidden="1" w:unhideWhenUsed="1"/>
     <w:lsdException w:name="Unresolved Mention" w:semiHidden="1" w:unhideWhenUsed="1"/>
-    <w:lsdException w:name="Smart Link" w:semiHidden="1" w:unhideWhenUsed="1"/>
   </w:latentStyles>
   <w:style w:type="paragraph" w:default="1" w:styleId="Normal">
     <w:name w:val="Normal"/>
@@ -17444,7 +17625,7 @@
 </file>
 
 <file path=word/glossary/document.xml><?xml version="1.0" encoding="utf-8"?>
-<w:glossaryDocument xmlns:wpc="http://schemas.microsoft.com/office/word/2010/wordprocessingCanvas" xmlns:cx="http://schemas.microsoft.com/office/drawing/2014/chartex" xmlns:cx1="http://schemas.microsoft.com/office/drawing/2015/9/8/chartex" xmlns:cx2="http://schemas.microsoft.com/office/drawing/2015/10/21/chartex" xmlns:cx3="http://schemas.microsoft.com/office/drawing/2016/5/9/chartex" xmlns:cx4="http://schemas.microsoft.com/office/drawing/2016/5/10/chartex" xmlns:cx5="http://schemas.microsoft.com/office/drawing/2016/5/11/chartex" xmlns:cx6="http://schemas.microsoft.com/office/drawing/2016/5/12/chartex" xmlns:cx7="http://schemas.microsoft.com/office/drawing/2016/5/13/chartex" xmlns:cx8="http://schemas.microsoft.com/office/drawing/2016/5/14/chartex" xmlns:mc="http://schemas.openxmlformats.org/markup-compatibility/2006" xmlns:aink="http://schemas.microsoft.com/office/drawing/2016/ink" xmlns:am3d="http://schemas.microsoft.com/office/drawing/2017/model3d" xmlns:o="urn:schemas-microsoft-com:office:office" xmlns:r="http://schemas.openxmlformats.org/officeDocument/2006/relationships" xmlns:m="http://schemas.openxmlformats.org/officeDocument/2006/math" xmlns:v="urn:schemas-microsoft-com:vml" xmlns:wp14="http://schemas.microsoft.com/office/word/2010/wordprocessingDrawing" xmlns:wp="http://schemas.openxmlformats.org/drawingml/2006/wordprocessingDrawing" xmlns:w10="urn:schemas-microsoft-com:office:word" xmlns:w="http://schemas.openxmlformats.org/wordprocessingml/2006/main" xmlns:w14="http://schemas.microsoft.com/office/word/2010/wordml" xmlns:w15="http://schemas.microsoft.com/office/word/2012/wordml" xmlns:w16cex="http://schemas.microsoft.com/office/word/2018/wordml/cex" xmlns:w16cid="http://schemas.microsoft.com/office/word/2016/wordml/cid" xmlns:w16="http://schemas.microsoft.com/office/word/2018/wordml" xmlns:w16sdtdh="http://schemas.microsoft.com/office/word/2020/wordml/sdtdatahash" xmlns:w16se="http://schemas.microsoft.com/office/word/2015/wordml/symex" xmlns:wpg="http://schemas.microsoft.com/office/word/2010/wordprocessingGroup" xmlns:wpi="http://schemas.microsoft.com/office/word/2010/wordprocessingInk" xmlns:wne="http://schemas.microsoft.com/office/word/2006/wordml" xmlns:wps="http://schemas.microsoft.com/office/word/2010/wordprocessingShape" mc:Ignorable="w14 w15 w16se w16cid w16 w16cex w16sdtdh wp14">
+<w:glossaryDocument xmlns:wpc="http://schemas.microsoft.com/office/word/2010/wordprocessingCanvas" xmlns:cx="http://schemas.microsoft.com/office/drawing/2014/chartex" xmlns:cx1="http://schemas.microsoft.com/office/drawing/2015/9/8/chartex" xmlns:cx2="http://schemas.microsoft.com/office/drawing/2015/10/21/chartex" xmlns:cx3="http://schemas.microsoft.com/office/drawing/2016/5/9/chartex" xmlns:cx4="http://schemas.microsoft.com/office/drawing/2016/5/10/chartex" xmlns:cx5="http://schemas.microsoft.com/office/drawing/2016/5/11/chartex" xmlns:cx6="http://schemas.microsoft.com/office/drawing/2016/5/12/chartex" xmlns:cx7="http://schemas.microsoft.com/office/drawing/2016/5/13/chartex" xmlns:cx8="http://schemas.microsoft.com/office/drawing/2016/5/14/chartex" xmlns:mc="http://schemas.openxmlformats.org/markup-compatibility/2006" xmlns:aink="http://schemas.microsoft.com/office/drawing/2016/ink" xmlns:am3d="http://schemas.microsoft.com/office/drawing/2017/model3d" xmlns:o="urn:schemas-microsoft-com:office:office" xmlns:r="http://schemas.openxmlformats.org/officeDocument/2006/relationships" xmlns:m="http://schemas.openxmlformats.org/officeDocument/2006/math" xmlns:v="urn:schemas-microsoft-com:vml" xmlns:wp14="http://schemas.microsoft.com/office/word/2010/wordprocessingDrawing" xmlns:wp="http://schemas.openxmlformats.org/drawingml/2006/wordprocessingDrawing" xmlns:w10="urn:schemas-microsoft-com:office:word" xmlns:w="http://schemas.openxmlformats.org/wordprocessingml/2006/main" xmlns:w14="http://schemas.microsoft.com/office/word/2010/wordml" xmlns:w15="http://schemas.microsoft.com/office/word/2012/wordml" xmlns:w16cid="http://schemas.microsoft.com/office/word/2016/wordml/cid" xmlns:w16se="http://schemas.microsoft.com/office/word/2015/wordml/symex" xmlns:wpg="http://schemas.microsoft.com/office/word/2010/wordprocessingGroup" xmlns:wpi="http://schemas.microsoft.com/office/word/2010/wordprocessingInk" xmlns:wne="http://schemas.microsoft.com/office/word/2006/wordml" xmlns:wps="http://schemas.microsoft.com/office/word/2010/wordprocessingShape" mc:Ignorable="w14 w15 w16se w16cid wp14">
   <w:docParts>
     <w:docPart>
       <w:docPartPr>
@@ -17572,7 +17753,7 @@
 </file>
 
 <file path=word/glossary/fontTable.xml><?xml version="1.0" encoding="utf-8"?>
-<w:fonts xmlns:mc="http://schemas.openxmlformats.org/markup-compatibility/2006" xmlns:r="http://schemas.openxmlformats.org/officeDocument/2006/relationships" xmlns:w="http://schemas.openxmlformats.org/wordprocessingml/2006/main" xmlns:w14="http://schemas.microsoft.com/office/word/2010/wordml" xmlns:w15="http://schemas.microsoft.com/office/word/2012/wordml" xmlns:w16cex="http://schemas.microsoft.com/office/word/2018/wordml/cex" xmlns:w16cid="http://schemas.microsoft.com/office/word/2016/wordml/cid" xmlns:w16="http://schemas.microsoft.com/office/word/2018/wordml" xmlns:w16sdtdh="http://schemas.microsoft.com/office/word/2020/wordml/sdtdatahash" xmlns:w16se="http://schemas.microsoft.com/office/word/2015/wordml/symex" mc:Ignorable="w14 w15 w16se w16cid w16 w16cex w16sdtdh">
+<w:fonts xmlns:mc="http://schemas.openxmlformats.org/markup-compatibility/2006" xmlns:r="http://schemas.openxmlformats.org/officeDocument/2006/relationships" xmlns:w="http://schemas.openxmlformats.org/wordprocessingml/2006/main" xmlns:w14="http://schemas.microsoft.com/office/word/2010/wordml" xmlns:w15="http://schemas.microsoft.com/office/word/2012/wordml" xmlns:w16cid="http://schemas.microsoft.com/office/word/2016/wordml/cid" xmlns:w16se="http://schemas.microsoft.com/office/word/2015/wordml/symex" mc:Ignorable="w14 w15 w16se w16cid">
   <w:font w:name="Symbol">
     <w:panose1 w:val="05050102010706020507"/>
     <w:charset w:val="02"/>
@@ -17649,7 +17830,7 @@
 </file>
 
 <file path=word/glossary/settings.xml><?xml version="1.0" encoding="utf-8"?>
-<w:settings xmlns:mc="http://schemas.openxmlformats.org/markup-compatibility/2006" xmlns:o="urn:schemas-microsoft-com:office:office" xmlns:r="http://schemas.openxmlformats.org/officeDocument/2006/relationships" xmlns:m="http://schemas.openxmlformats.org/officeDocument/2006/math" xmlns:v="urn:schemas-microsoft-com:vml" xmlns:w10="urn:schemas-microsoft-com:office:word" xmlns:w="http://schemas.openxmlformats.org/wordprocessingml/2006/main" xmlns:w14="http://schemas.microsoft.com/office/word/2010/wordml" xmlns:w15="http://schemas.microsoft.com/office/word/2012/wordml" xmlns:w16cex="http://schemas.microsoft.com/office/word/2018/wordml/cex" xmlns:w16cid="http://schemas.microsoft.com/office/word/2016/wordml/cid" xmlns:w16="http://schemas.microsoft.com/office/word/2018/wordml" xmlns:w16sdtdh="http://schemas.microsoft.com/office/word/2020/wordml/sdtdatahash" xmlns:w16se="http://schemas.microsoft.com/office/word/2015/wordml/symex" xmlns:sl="http://schemas.openxmlformats.org/schemaLibrary/2006/main" mc:Ignorable="w14 w15 w16se w16cid w16 w16cex w16sdtdh">
+<w:settings xmlns:mc="http://schemas.openxmlformats.org/markup-compatibility/2006" xmlns:o="urn:schemas-microsoft-com:office:office" xmlns:r="http://schemas.openxmlformats.org/officeDocument/2006/relationships" xmlns:m="http://schemas.openxmlformats.org/officeDocument/2006/math" xmlns:v="urn:schemas-microsoft-com:vml" xmlns:w10="urn:schemas-microsoft-com:office:word" xmlns:w="http://schemas.openxmlformats.org/wordprocessingml/2006/main" xmlns:w14="http://schemas.microsoft.com/office/word/2010/wordml" xmlns:w15="http://schemas.microsoft.com/office/word/2012/wordml" xmlns:w16cid="http://schemas.microsoft.com/office/word/2016/wordml/cid" xmlns:w16se="http://schemas.microsoft.com/office/word/2015/wordml/symex" xmlns:sl="http://schemas.openxmlformats.org/schemaLibrary/2006/main" mc:Ignorable="w14 w15 w16se w16cid">
   <w:view w:val="normal"/>
   <w:defaultTabStop w:val="708"/>
   <w:hyphenationZone w:val="425"/>
@@ -17677,6 +17858,7 @@
     <w:rsid w:val="00B266D5"/>
     <w:rsid w:val="00C704D2"/>
     <w:rsid w:val="00E6607C"/>
+    <w:rsid w:val="00E668AB"/>
     <w:rsid w:val="00F547DF"/>
   </w:rsids>
   <m:mathPr>
@@ -17701,7 +17883,7 @@
 </file>
 
 <file path=word/glossary/styles.xml><?xml version="1.0" encoding="utf-8"?>
-<w:styles xmlns:mc="http://schemas.openxmlformats.org/markup-compatibility/2006" xmlns:r="http://schemas.openxmlformats.org/officeDocument/2006/relationships" xmlns:w="http://schemas.openxmlformats.org/wordprocessingml/2006/main" xmlns:w14="http://schemas.microsoft.com/office/word/2010/wordml" xmlns:w15="http://schemas.microsoft.com/office/word/2012/wordml" xmlns:w16cex="http://schemas.microsoft.com/office/word/2018/wordml/cex" xmlns:w16cid="http://schemas.microsoft.com/office/word/2016/wordml/cid" xmlns:w16="http://schemas.microsoft.com/office/word/2018/wordml" xmlns:w16sdtdh="http://schemas.microsoft.com/office/word/2020/wordml/sdtdatahash" xmlns:w16se="http://schemas.microsoft.com/office/word/2015/wordml/symex" mc:Ignorable="w14 w15 w16se w16cid w16 w16cex w16sdtdh">
+<w:styles xmlns:mc="http://schemas.openxmlformats.org/markup-compatibility/2006" xmlns:r="http://schemas.openxmlformats.org/officeDocument/2006/relationships" xmlns:w="http://schemas.openxmlformats.org/wordprocessingml/2006/main" xmlns:w14="http://schemas.microsoft.com/office/word/2010/wordml" xmlns:w15="http://schemas.microsoft.com/office/word/2012/wordml" xmlns:w16cid="http://schemas.microsoft.com/office/word/2016/wordml/cid" xmlns:w16se="http://schemas.microsoft.com/office/word/2015/wordml/symex" mc:Ignorable="w14 w15 w16se w16cid">
   <w:docDefaults>
     <w:rPrDefault>
       <w:rPr>
@@ -17719,7 +17901,7 @@
       </w:pPr>
     </w:pPrDefault>
   </w:docDefaults>
-  <w:latentStyles w:defLockedState="0" w:defUIPriority="99" w:defSemiHidden="0" w:defUnhideWhenUsed="0" w:defQFormat="0" w:count="376">
+  <w:latentStyles w:defLockedState="0" w:defUIPriority="99" w:defSemiHidden="0" w:defUnhideWhenUsed="0" w:defQFormat="0" w:count="375">
     <w:lsdException w:name="Normal" w:uiPriority="0" w:qFormat="1"/>
     <w:lsdException w:name="heading 1" w:uiPriority="9" w:qFormat="1"/>
     <w:lsdException w:name="heading 2" w:semiHidden="1" w:uiPriority="9" w:unhideWhenUsed="1" w:qFormat="1"/>
@@ -18095,7 +18277,6 @@
     <w:lsdException w:name="Smart Hyperlink" w:semiHidden="1" w:unhideWhenUsed="1"/>
     <w:lsdException w:name="Hashtag" w:semiHidden="1" w:unhideWhenUsed="1"/>
     <w:lsdException w:name="Unresolved Mention" w:semiHidden="1" w:unhideWhenUsed="1"/>
-    <w:lsdException w:name="Smart Link" w:semiHidden="1" w:unhideWhenUsed="1"/>
   </w:latentStyles>
   <w:style w:type="paragraph" w:default="1" w:styleId="Normal">
     <w:name w:val="Normal"/>
@@ -18176,7 +18357,7 @@
 </file>
 
 <file path=word/glossary/webSettings.xml><?xml version="1.0" encoding="utf-8"?>
-<w:webSettings xmlns:mc="http://schemas.openxmlformats.org/markup-compatibility/2006" xmlns:r="http://schemas.openxmlformats.org/officeDocument/2006/relationships" xmlns:w="http://schemas.openxmlformats.org/wordprocessingml/2006/main" xmlns:w14="http://schemas.microsoft.com/office/word/2010/wordml" xmlns:w15="http://schemas.microsoft.com/office/word/2012/wordml" xmlns:w16cex="http://schemas.microsoft.com/office/word/2018/wordml/cex" xmlns:w16cid="http://schemas.microsoft.com/office/word/2016/wordml/cid" xmlns:w16="http://schemas.microsoft.com/office/word/2018/wordml" xmlns:w16sdtdh="http://schemas.microsoft.com/office/word/2020/wordml/sdtdatahash" xmlns:w16se="http://schemas.microsoft.com/office/word/2015/wordml/symex" mc:Ignorable="w14 w15 w16se w16cid w16 w16cex w16sdtdh">
+<w:webSettings xmlns:mc="http://schemas.openxmlformats.org/markup-compatibility/2006" xmlns:r="http://schemas.openxmlformats.org/officeDocument/2006/relationships" xmlns:w="http://schemas.openxmlformats.org/wordprocessingml/2006/main" xmlns:w14="http://schemas.microsoft.com/office/word/2010/wordml" xmlns:w15="http://schemas.microsoft.com/office/word/2012/wordml" xmlns:w16cid="http://schemas.microsoft.com/office/word/2016/wordml/cid" xmlns:w16se="http://schemas.microsoft.com/office/word/2015/wordml/symex" mc:Ignorable="w14 w15 w16se w16cid">
   <w:optimizeForBrowser/>
   <w:allowPNG/>
 </w:webSettings>

</xml_diff>